<commit_message>
Update project prompt doc
Co-Authored-By: Claude Sonnet 5 <noreply@anthropic.com>
</commit_message>
<xml_diff>
--- a/Prompt pour Lavage auto.docx
+++ b/Prompt pour Lavage auto.docx
@@ -277,7 +277,7 @@
     <w:p>
       <w:r>
         <w:pict w14:anchorId="60E7037E">
-          <v:rect id="_x0000_i1037" style="width:0;height:1.5pt" o:hralign="center" o:hrstd="t" o:hr="t" fillcolor="#a0a0a0" stroked="f"/>
+          <v:rect id="_x0000_i1025" style="width:0;height:1.5pt" o:hralign="center" o:hrstd="t" o:hr="t" fillcolor="#a0a0a0" stroked="f"/>
         </w:pict>
       </w:r>
     </w:p>
@@ -487,7 +487,7 @@
     <w:p>
       <w:r>
         <w:pict w14:anchorId="197DD7B6">
-          <v:rect id="_x0000_i1038" style="width:0;height:1.5pt" o:hralign="center" o:hrstd="t" o:hr="t" fillcolor="#a0a0a0" stroked="f"/>
+          <v:rect id="_x0000_i1026" style="width:0;height:1.5pt" o:hralign="center" o:hrstd="t" o:hr="t" fillcolor="#a0a0a0" stroked="f"/>
         </w:pict>
       </w:r>
     </w:p>
@@ -616,7 +616,23 @@
           <w:sz w:val="28"/>
           <w:szCs w:val="28"/>
         </w:rPr>
-        <w:t xml:space="preserve">Construire le user flow autour de cette fonctionnalité principale (définir une fois l’utilisateurs arrivent dans son SaaS qu’est-ce qu’il va voir quel chemin qu’il va prendre </w:t>
+        <w:t xml:space="preserve">Construire </w:t>
+      </w:r>
+      <w:proofErr w:type="gramStart"/>
+      <w:r>
+        <w:rPr>
+          <w:sz w:val="28"/>
+          <w:szCs w:val="28"/>
+        </w:rPr>
+        <w:t>le user</w:t>
+      </w:r>
+      <w:proofErr w:type="gramEnd"/>
+      <w:r>
+        <w:rPr>
+          <w:sz w:val="28"/>
+          <w:szCs w:val="28"/>
+        </w:rPr>
+        <w:t xml:space="preserve"> flow autour de cette fonctionnalité principale (définir une fois l’utilisateurs arrivent dans son SaaS qu’est-ce qu’il va voir quel chemin qu’il va prendre </w:t>
       </w:r>
     </w:p>
     <w:p>
@@ -1091,6 +1107,7 @@
         </w:rPr>
       </w:pPr>
       <w:proofErr w:type="spellStart"/>
+      <w:proofErr w:type="gramStart"/>
       <w:r>
         <w:rPr>
           <w:sz w:val="28"/>
@@ -1099,6 +1116,7 @@
         <w:t>utilsé</w:t>
       </w:r>
       <w:proofErr w:type="spellEnd"/>
+      <w:proofErr w:type="gramEnd"/>
       <w:r>
         <w:rPr>
           <w:sz w:val="28"/>
@@ -1107,6 +1125,7 @@
         <w:t xml:space="preserve"> </w:t>
       </w:r>
       <w:proofErr w:type="spellStart"/>
+      <w:proofErr w:type="gramStart"/>
       <w:r>
         <w:rPr>
           <w:sz w:val="28"/>
@@ -1131,6 +1150,7 @@
         <w:t>css</w:t>
       </w:r>
       <w:proofErr w:type="spellEnd"/>
+      <w:proofErr w:type="gramEnd"/>
       <w:r>
         <w:rPr>
           <w:sz w:val="28"/>
@@ -1258,7 +1278,23 @@
           <w:sz w:val="28"/>
           <w:szCs w:val="28"/>
         </w:rPr>
-        <w:t xml:space="preserve">Construire le user flow autour de cette fonctionnalité principale (définir une fois l’utilisateurs arrivent dans son SaaS qu’est-ce qu’il va voir quel chemin qu’il va prendre </w:t>
+        <w:t xml:space="preserve">Construire </w:t>
+      </w:r>
+      <w:proofErr w:type="gramStart"/>
+      <w:r>
+        <w:rPr>
+          <w:sz w:val="28"/>
+          <w:szCs w:val="28"/>
+        </w:rPr>
+        <w:t>le user</w:t>
+      </w:r>
+      <w:proofErr w:type="gramEnd"/>
+      <w:r>
+        <w:rPr>
+          <w:sz w:val="28"/>
+          <w:szCs w:val="28"/>
+        </w:rPr>
+        <w:t xml:space="preserve"> flow autour de cette fonctionnalité principale (définir une fois l’utilisateurs arrivent dans son SaaS qu’est-ce qu’il va voir quel chemin qu’il va prendre </w:t>
       </w:r>
     </w:p>
     <w:p>
@@ -1417,13 +1453,252 @@
       <w:pPr>
         <w:rPr>
           <w:vanish/>
+          <w:color w:val="EE0000"/>
           <w:specVanish/>
         </w:rPr>
       </w:pPr>
     </w:p>
     <w:p>
-      <w:r>
+      <w:pPr>
+        <w:rPr>
+          <w:color w:val="EE0000"/>
+        </w:rPr>
+      </w:pPr>
+      <w:r>
+        <w:rPr>
+          <w:color w:val="EE0000"/>
+        </w:rPr>
         <w:t xml:space="preserve"> </w:t>
+      </w:r>
+      <w:r>
+        <w:rPr>
+          <w:color w:val="EE0000"/>
+        </w:rPr>
+        <w:t xml:space="preserve">"J'ai une erreur RLS du type new </w:t>
+      </w:r>
+      <w:proofErr w:type="spellStart"/>
+      <w:r>
+        <w:rPr>
+          <w:color w:val="EE0000"/>
+        </w:rPr>
+        <w:t>row</w:t>
+      </w:r>
+      <w:proofErr w:type="spellEnd"/>
+      <w:r>
+        <w:rPr>
+          <w:color w:val="EE0000"/>
+        </w:rPr>
+        <w:t xml:space="preserve"> </w:t>
+      </w:r>
+      <w:proofErr w:type="spellStart"/>
+      <w:r>
+        <w:rPr>
+          <w:color w:val="EE0000"/>
+        </w:rPr>
+        <w:t>violates</w:t>
+      </w:r>
+      <w:proofErr w:type="spellEnd"/>
+      <w:r>
+        <w:rPr>
+          <w:color w:val="EE0000"/>
+        </w:rPr>
+        <w:t xml:space="preserve"> </w:t>
+      </w:r>
+      <w:proofErr w:type="spellStart"/>
+      <w:r>
+        <w:rPr>
+          <w:color w:val="EE0000"/>
+        </w:rPr>
+        <w:t>row-level</w:t>
+      </w:r>
+      <w:proofErr w:type="spellEnd"/>
+      <w:r>
+        <w:rPr>
+          <w:color w:val="EE0000"/>
+        </w:rPr>
+        <w:t xml:space="preserve"> </w:t>
+      </w:r>
+      <w:proofErr w:type="spellStart"/>
+      <w:r>
+        <w:rPr>
+          <w:color w:val="EE0000"/>
+        </w:rPr>
+        <w:t>security</w:t>
+      </w:r>
+      <w:proofErr w:type="spellEnd"/>
+      <w:r>
+        <w:rPr>
+          <w:color w:val="EE0000"/>
+        </w:rPr>
+        <w:t xml:space="preserve"> </w:t>
+      </w:r>
+      <w:proofErr w:type="spellStart"/>
+      <w:r>
+        <w:rPr>
+          <w:color w:val="EE0000"/>
+        </w:rPr>
+        <w:t>policy</w:t>
+      </w:r>
+      <w:proofErr w:type="spellEnd"/>
+      <w:r>
+        <w:rPr>
+          <w:color w:val="EE0000"/>
+        </w:rPr>
+        <w:t xml:space="preserve"> for table "X" en créant [décris l'action, </w:t>
+      </w:r>
+      <w:proofErr w:type="gramStart"/>
+      <w:r>
+        <w:rPr>
+          <w:color w:val="EE0000"/>
+        </w:rPr>
+        <w:t>ex:</w:t>
+      </w:r>
+      <w:proofErr w:type="gramEnd"/>
+      <w:r>
+        <w:rPr>
+          <w:color w:val="EE0000"/>
+        </w:rPr>
+        <w:t xml:space="preserve"> une réservation]. On a déjà eu exactement ce problème sur la table stations (voir mémoire [[</w:t>
+      </w:r>
+      <w:proofErr w:type="spellStart"/>
+      <w:r>
+        <w:rPr>
+          <w:color w:val="EE0000"/>
+        </w:rPr>
+        <w:t>backend_migration</w:t>
+      </w:r>
+      <w:proofErr w:type="spellEnd"/>
+      <w:r>
+        <w:rPr>
+          <w:color w:val="EE0000"/>
+        </w:rPr>
+        <w:t xml:space="preserve">]]) : le code </w:t>
+      </w:r>
+      <w:proofErr w:type="gramStart"/>
+      <w:r>
+        <w:rPr>
+          <w:color w:val="EE0000"/>
+        </w:rPr>
+        <w:t>fait .insert</w:t>
+      </w:r>
+      <w:proofErr w:type="gramEnd"/>
+      <w:r>
+        <w:rPr>
+          <w:color w:val="EE0000"/>
+        </w:rPr>
+        <w:t>(</w:t>
+      </w:r>
+      <w:proofErr w:type="gramStart"/>
+      <w:r>
+        <w:rPr>
+          <w:color w:val="EE0000"/>
+        </w:rPr>
+        <w:t>).select</w:t>
+      </w:r>
+      <w:proofErr w:type="gramEnd"/>
+      <w:r>
+        <w:rPr>
+          <w:color w:val="EE0000"/>
+        </w:rPr>
+        <w:t>() pour récupérer la ligne tout juste créée, mais la règle de lecture (SELECT) de cette table dépend d'une donnée qui n'existe pas encore à cet instant précis (</w:t>
+      </w:r>
+      <w:proofErr w:type="gramStart"/>
+      <w:r>
+        <w:rPr>
+          <w:color w:val="EE0000"/>
+        </w:rPr>
+        <w:t>ex:</w:t>
+      </w:r>
+      <w:proofErr w:type="gramEnd"/>
+      <w:r>
+        <w:rPr>
+          <w:color w:val="EE0000"/>
+        </w:rPr>
+        <w:t xml:space="preserve"> un profil lié pas encore créé) — donc </w:t>
+      </w:r>
+      <w:proofErr w:type="spellStart"/>
+      <w:r>
+        <w:rPr>
+          <w:color w:val="EE0000"/>
+        </w:rPr>
+        <w:t>Postgres</w:t>
+      </w:r>
+      <w:proofErr w:type="spellEnd"/>
+      <w:r>
+        <w:rPr>
+          <w:color w:val="EE0000"/>
+        </w:rPr>
+        <w:t xml:space="preserve"> refuse de renvoyer la ligne et annule tout. Vérifie si c'est le même piège ici : ajoute une condition du type </w:t>
+      </w:r>
+      <w:proofErr w:type="spellStart"/>
+      <w:r>
+        <w:rPr>
+          <w:color w:val="EE0000"/>
+        </w:rPr>
+        <w:t>created_by</w:t>
+      </w:r>
+      <w:proofErr w:type="spellEnd"/>
+      <w:r>
+        <w:rPr>
+          <w:color w:val="EE0000"/>
+        </w:rPr>
+        <w:t xml:space="preserve"> = </w:t>
+      </w:r>
+      <w:proofErr w:type="spellStart"/>
+      <w:proofErr w:type="gramStart"/>
+      <w:r>
+        <w:rPr>
+          <w:color w:val="EE0000"/>
+        </w:rPr>
+        <w:t>auth.uid</w:t>
+      </w:r>
+      <w:proofErr w:type="spellEnd"/>
+      <w:r>
+        <w:rPr>
+          <w:color w:val="EE0000"/>
+        </w:rPr>
+        <w:t>(</w:t>
+      </w:r>
+      <w:proofErr w:type="gramEnd"/>
+      <w:r>
+        <w:rPr>
+          <w:color w:val="EE0000"/>
+        </w:rPr>
+        <w:t xml:space="preserve">) (ou équivalent) à la </w:t>
+      </w:r>
+      <w:proofErr w:type="spellStart"/>
+      <w:r>
+        <w:rPr>
+          <w:color w:val="EE0000"/>
+        </w:rPr>
+        <w:t>policy</w:t>
+      </w:r>
+      <w:proofErr w:type="spellEnd"/>
+      <w:r>
+        <w:rPr>
+          <w:color w:val="EE0000"/>
+        </w:rPr>
+        <w:t xml:space="preserve"> SELECT de la table concernée pour que l'utilisateur puisse toujours voir ce qu'il vient lui-même de créer."</w:t>
+      </w:r>
+    </w:p>
+    <w:p>
+      <w:pPr>
+        <w:rPr>
+          <w:color w:val="EE0000"/>
+        </w:rPr>
+      </w:pPr>
+    </w:p>
+    <w:p>
+      <w:pPr>
+        <w:rPr>
+          <w:color w:val="EE0000"/>
+        </w:rPr>
+      </w:pPr>
+      <w:r>
+        <w:rPr>
+          <w:color w:val="EE0000"/>
+        </w:rPr>
+        <w:t>Je l'ai aussi noté dans la mémoire du projet, donc même sans ce prompt je vais naturellement vérifier ce piège en premier sur les prochains modules (réservations, transactions).</w:t>
       </w:r>
     </w:p>
     <w:sectPr>
@@ -2192,6 +2467,7 @@
   <w:style w:type="character" w:default="1" w:styleId="Policepardfaut">
     <w:name w:val="Default Paragraph Font"/>
     <w:uiPriority w:val="1"/>
+    <w:semiHidden/>
     <w:unhideWhenUsed/>
   </w:style>
   <w:style w:type="table" w:default="1" w:styleId="TableauNormal">

</xml_diff>